<commit_message>
Update resume docx with latest doc edits
Co-Authored-By: Claude Fable 5.1 <noreply@anthropic.com>
Claude-Session: https://claude.ai/code/session_01WfpQE1SmBPxk4yrHr8NNwX
</commit_message>
<xml_diff>
--- a/resume/Bryan_Hang_Zhang_Resume.docx
+++ b/resume/Bryan_Hang_Zhang_Resume.docx
@@ -45,7 +45,7 @@
         </w:rPr>
         <w:t xml:space="preserve">bryan.zhanghang@gmail.com · </w:t>
       </w:r>
-      <w:hyperlink w:history="1" r:id="rIdceijuolr95zs1x-6lwdzo">
+      <w:hyperlink w:history="1" r:id="rId-vhojqzp_pfocpcwnojlt">
         <w:r>
           <w:rPr>
             <w:rFonts w:ascii="Helvetica Neue" w:cs="Helvetica Neue" w:eastAsia="Helvetica Neue" w:hAnsi="Helvetica Neue"/>
@@ -113,7 +113,7 @@
           <w:sz w:val="20"/>
           <w:szCs w:val="20"/>
         </w:rPr>
-        <w:t xml:space="preserve"> · Applied Scientist II, Localization &amp; Science Lead · Pittsburgh / Global · 2020 – present</w:t>
+        <w:t xml:space="preserve"> · Applied Scientist II, Localization &amp; Science Lead · 2020 – present</w:t>
       </w:r>
     </w:p>
     <w:p>
@@ -189,7 +189,27 @@
           <w:sz w:val="20"/>
           <w:szCs w:val="20"/>
         </w:rPr>
-        <w:t xml:space="preserve">Defined and shipped the GenAI localization stack: an LLM brand-voice agent and agentic catalog localization pipelines (LLMs, RAG, MT), with human review where tone and cultural fit matter.</w:t>
+        <w:t xml:space="preserve">Defined and shipped the </w:t>
+      </w:r>
+      <w:r>
+        <w:rPr>
+          <w:rFonts w:ascii="Helvetica Neue" w:cs="Helvetica Neue" w:eastAsia="Helvetica Neue" w:hAnsi="Helvetica Neue"/>
+          <w:i/>
+          <w:iCs/>
+          <w:color w:val="1D1D1F"/>
+          <w:sz w:val="20"/>
+          <w:szCs w:val="20"/>
+        </w:rPr>
+        <w:t xml:space="preserve">GenAI localization stack</w:t>
+      </w:r>
+      <w:r>
+        <w:rPr>
+          <w:rFonts w:ascii="Helvetica Neue" w:cs="Helvetica Neue" w:eastAsia="Helvetica Neue" w:hAnsi="Helvetica Neue"/>
+          <w:color w:val="1D1D1F"/>
+          <w:sz w:val="20"/>
+          <w:szCs w:val="20"/>
+        </w:rPr>
+        <w:t xml:space="preserve">: an LLM brand-voice agent and agentic catalog localization pipelines (LLMs, RAG, MT), with human review where tone and cultural fit matter.</w:t>
       </w:r>
     </w:p>
     <w:p>
@@ -208,7 +228,47 @@
           <w:sz w:val="20"/>
           <w:szCs w:val="20"/>
         </w:rPr>
-        <w:t xml:space="preserve">Delivered two named systems: Summarly, cross-lingual product trans-creation, live in 20+ language pairs; LocRegen, SLM title optimization with 55% fewer errors than LLM baselines.</w:t>
+        <w:t xml:space="preserve">Delivered two localization/multilingual systems: </w:t>
+      </w:r>
+      <w:r>
+        <w:rPr>
+          <w:rFonts w:ascii="Helvetica Neue" w:cs="Helvetica Neue" w:eastAsia="Helvetica Neue" w:hAnsi="Helvetica Neue"/>
+          <w:i/>
+          <w:iCs/>
+          <w:color w:val="1D1D1F"/>
+          <w:sz w:val="20"/>
+          <w:szCs w:val="20"/>
+        </w:rPr>
+        <w:t xml:space="preserve">Summarly</w:t>
+      </w:r>
+      <w:r>
+        <w:rPr>
+          <w:rFonts w:ascii="Helvetica Neue" w:cs="Helvetica Neue" w:eastAsia="Helvetica Neue" w:hAnsi="Helvetica Neue"/>
+          <w:color w:val="1D1D1F"/>
+          <w:sz w:val="20"/>
+          <w:szCs w:val="20"/>
+        </w:rPr>
+        <w:t xml:space="preserve">, cross-lingual product trans-creation, live in 20+ language pairs; </w:t>
+      </w:r>
+      <w:r>
+        <w:rPr>
+          <w:rFonts w:ascii="Helvetica Neue" w:cs="Helvetica Neue" w:eastAsia="Helvetica Neue" w:hAnsi="Helvetica Neue"/>
+          <w:i/>
+          <w:iCs/>
+          <w:color w:val="1D1D1F"/>
+          <w:sz w:val="20"/>
+          <w:szCs w:val="20"/>
+        </w:rPr>
+        <w:t xml:space="preserve">LocRegen</w:t>
+      </w:r>
+      <w:r>
+        <w:rPr>
+          <w:rFonts w:ascii="Helvetica Neue" w:cs="Helvetica Neue" w:eastAsia="Helvetica Neue" w:hAnsi="Helvetica Neue"/>
+          <w:color w:val="1D1D1F"/>
+          <w:sz w:val="20"/>
+          <w:szCs w:val="20"/>
+        </w:rPr>
+        <w:t xml:space="preserve">, product title optimization using small language model with 55% fewer errors than LLM baselines.</w:t>
       </w:r>
     </w:p>
     <w:p>
@@ -246,7 +306,7 @@
           <w:sz w:val="20"/>
           <w:szCs w:val="20"/>
         </w:rPr>
-        <w:t xml:space="preserve">Lead a team of 5–6 scientists and engineers. Wrote three strategy documents for VP leadership that funded this work. Mentored 20+ scientists, engineers and interns over 8 years.</w:t>
+        <w:t xml:space="preserve">Lead a team of 5–6 scientists and engineers in various projects. Wrote three strategy documents for VP leadership that sponsored my projects above. Mentored 20+ scientists, engineers and interns over 8 years.</w:t>
       </w:r>
     </w:p>
     <w:p>

</xml_diff>